<commit_message>
properties artifact, explicit saving
</commit_message>
<xml_diff>
--- a/doc/sources/VIL Extensions.docx
+++ b/doc/sources/VIL Extensions.docx
@@ -510,17 +510,7 @@
             <w:szCs w:val="28"/>
             <w:lang w:val="en-GB"/>
           </w:rPr>
-          <w:t>June</w:t>
-        </w:r>
-        <w:r>
-          <w:rPr>
-            <w:rFonts w:ascii="Arial" w:hAnsi="Arial" w:cs="Arial"/>
-            <w:b/>
-            <w:sz w:val="28"/>
-            <w:szCs w:val="28"/>
-            <w:lang w:val="en-GB"/>
-          </w:rPr>
-          <w:t xml:space="preserve"> </w:t>
+          <w:t xml:space="preserve">June </w:t>
         </w:r>
       </w:ins>
       <w:r>
@@ -2379,7 +2369,7 @@
         </w:rPr>
         <w:fldChar w:fldCharType="separate"/>
       </w:r>
-      <w:ins w:id="6" w:author="Holger Eichelberger" w:date="2026-06-19T13:13:00Z">
+      <w:ins w:id="6" w:author="Holger Eichelberger" w:date="2026-06-20T09:36:00Z">
         <w:r>
           <w:rPr>
             <w:noProof/>
@@ -2493,7 +2483,7 @@
         </w:rPr>
         <w:fldChar w:fldCharType="separate"/>
       </w:r>
-      <w:ins w:id="8" w:author="Holger Eichelberger" w:date="2026-06-19T13:13:00Z">
+      <w:ins w:id="8" w:author="Holger Eichelberger" w:date="2026-06-20T09:36:00Z">
         <w:r>
           <w:rPr>
             <w:noProof/>
@@ -2697,7 +2687,7 @@
         </w:rPr>
         <w:fldChar w:fldCharType="separate"/>
       </w:r>
-      <w:ins w:id="10" w:author="Holger Eichelberger" w:date="2026-06-19T13:13:00Z">
+      <w:ins w:id="10" w:author="Holger Eichelberger" w:date="2026-06-20T09:36:00Z">
         <w:r>
           <w:rPr>
             <w:noProof/>
@@ -2811,7 +2801,7 @@
         </w:rPr>
         <w:fldChar w:fldCharType="separate"/>
       </w:r>
-      <w:ins w:id="12" w:author="Holger Eichelberger" w:date="2026-06-19T13:13:00Z">
+      <w:ins w:id="12" w:author="Holger Eichelberger" w:date="2026-06-20T09:36:00Z">
         <w:r>
           <w:rPr>
             <w:noProof/>
@@ -3015,7 +3005,7 @@
         </w:rPr>
         <w:fldChar w:fldCharType="separate"/>
       </w:r>
-      <w:ins w:id="14" w:author="Holger Eichelberger" w:date="2026-06-19T13:13:00Z">
+      <w:ins w:id="14" w:author="Holger Eichelberger" w:date="2026-06-20T09:36:00Z">
         <w:r>
           <w:rPr>
             <w:noProof/>
@@ -3220,7 +3210,7 @@
         </w:rPr>
         <w:fldChar w:fldCharType="separate"/>
       </w:r>
-      <w:ins w:id="16" w:author="Holger Eichelberger" w:date="2026-06-19T13:13:00Z">
+      <w:ins w:id="16" w:author="Holger Eichelberger" w:date="2026-06-20T09:36:00Z">
         <w:r>
           <w:rPr>
             <w:noProof/>
@@ -3336,7 +3326,7 @@
         </w:rPr>
         <w:fldChar w:fldCharType="separate"/>
       </w:r>
-      <w:ins w:id="18" w:author="Holger Eichelberger" w:date="2026-06-19T13:13:00Z">
+      <w:ins w:id="18" w:author="Holger Eichelberger" w:date="2026-06-20T09:36:00Z">
         <w:r>
           <w:rPr>
             <w:noProof/>
@@ -3452,7 +3442,7 @@
         </w:rPr>
         <w:fldChar w:fldCharType="separate"/>
       </w:r>
-      <w:ins w:id="20" w:author="Holger Eichelberger" w:date="2026-06-19T13:13:00Z">
+      <w:ins w:id="20" w:author="Holger Eichelberger" w:date="2026-06-20T09:36:00Z">
         <w:r>
           <w:rPr>
             <w:noProof/>
@@ -3575,7 +3565,7 @@
         </w:rPr>
         <w:fldChar w:fldCharType="separate"/>
       </w:r>
-      <w:ins w:id="22" w:author="Holger Eichelberger" w:date="2026-06-19T13:13:00Z">
+      <w:ins w:id="22" w:author="Holger Eichelberger" w:date="2026-06-20T09:36:00Z">
         <w:r>
           <w:rPr>
             <w:noProof/>
@@ -3691,7 +3681,7 @@
         </w:rPr>
         <w:fldChar w:fldCharType="separate"/>
       </w:r>
-      <w:ins w:id="24" w:author="Holger Eichelberger" w:date="2026-06-19T13:13:00Z">
+      <w:ins w:id="24" w:author="Holger Eichelberger" w:date="2026-06-20T09:36:00Z">
         <w:r>
           <w:rPr>
             <w:noProof/>
@@ -3807,7 +3797,7 @@
         </w:rPr>
         <w:fldChar w:fldCharType="separate"/>
       </w:r>
-      <w:ins w:id="26" w:author="Holger Eichelberger" w:date="2026-06-19T13:13:00Z">
+      <w:ins w:id="26" w:author="Holger Eichelberger" w:date="2026-06-20T09:36:00Z">
         <w:r>
           <w:rPr>
             <w:noProof/>
@@ -3923,7 +3913,7 @@
         </w:rPr>
         <w:fldChar w:fldCharType="separate"/>
       </w:r>
-      <w:ins w:id="28" w:author="Holger Eichelberger" w:date="2026-06-19T13:13:00Z">
+      <w:ins w:id="28" w:author="Holger Eichelberger" w:date="2026-06-20T09:36:00Z">
         <w:r>
           <w:rPr>
             <w:noProof/>
@@ -4039,7 +4029,7 @@
         </w:rPr>
         <w:fldChar w:fldCharType="separate"/>
       </w:r>
-      <w:ins w:id="30" w:author="Holger Eichelberger" w:date="2026-06-19T13:13:00Z">
+      <w:ins w:id="30" w:author="Holger Eichelberger" w:date="2026-06-20T09:36:00Z">
         <w:r>
           <w:rPr>
             <w:noProof/>
@@ -4136,7 +4126,7 @@
         </w:rPr>
         <w:fldChar w:fldCharType="separate"/>
       </w:r>
-      <w:ins w:id="32" w:author="Holger Eichelberger" w:date="2026-06-19T13:13:00Z">
+      <w:ins w:id="32" w:author="Holger Eichelberger" w:date="2026-06-20T09:36:00Z">
         <w:r>
           <w:rPr>
             <w:noProof/>
@@ -4585,11 +4575,11 @@
         </w:rPr>
         <w:fldChar w:fldCharType="separate"/>
       </w:r>
-      <w:ins w:id="46" w:author="Holger Eichelberger" w:date="2026-06-19T13:13:00Z">
+      <w:ins w:id="46" w:author="Holger Eichelberger" w:date="2026-06-20T09:36:00Z">
         <w:r>
           <w:rPr>
             <w:lang w:val="en-GB"/>
-            <w:rPrChange w:id="47" w:author="Holger Eichelberger" w:date="2026-06-19T13:13:00Z">
+            <w:rPrChange w:id="47" w:author="Holger Eichelberger" w:date="2026-06-20T09:36:00Z">
               <w:rPr/>
             </w:rPrChange>
           </w:rPr>
@@ -4599,7 +4589,7 @@
           <w:rPr>
             <w:noProof/>
             <w:lang w:val="en-GB"/>
-            <w:rPrChange w:id="48" w:author="Holger Eichelberger" w:date="2026-06-19T13:13:00Z">
+            <w:rPrChange w:id="48" w:author="Holger Eichelberger" w:date="2026-06-20T09:36:00Z">
               <w:rPr>
                 <w:noProof/>
               </w:rPr>
@@ -4658,11 +4648,11 @@
         </w:rPr>
         <w:fldChar w:fldCharType="separate"/>
       </w:r>
-      <w:ins w:id="50" w:author="Holger Eichelberger" w:date="2026-06-19T13:13:00Z">
+      <w:ins w:id="50" w:author="Holger Eichelberger" w:date="2026-06-20T09:36:00Z">
         <w:r>
           <w:rPr>
             <w:lang w:val="en-GB"/>
-            <w:rPrChange w:id="51" w:author="Holger Eichelberger" w:date="2026-06-19T13:13:00Z">
+            <w:rPrChange w:id="51" w:author="Holger Eichelberger" w:date="2026-06-20T09:36:00Z">
               <w:rPr/>
             </w:rPrChange>
           </w:rPr>
@@ -4672,7 +4662,7 @@
           <w:rPr>
             <w:noProof/>
             <w:lang w:val="en-GB"/>
-            <w:rPrChange w:id="52" w:author="Holger Eichelberger" w:date="2026-06-19T13:13:00Z">
+            <w:rPrChange w:id="52" w:author="Holger Eichelberger" w:date="2026-06-20T09:36:00Z">
               <w:rPr>
                 <w:noProof/>
               </w:rPr>
@@ -4860,11 +4850,11 @@
             <w:r>
               <w:fldChar w:fldCharType="separate"/>
             </w:r>
-            <w:ins w:id="54" w:author="Holger Eichelberger" w:date="2026-06-19T13:13:00Z">
+            <w:ins w:id="54" w:author="Holger Eichelberger" w:date="2026-06-20T09:36:00Z">
               <w:r>
                 <w:rPr>
                   <w:lang w:val="en-GB"/>
-                  <w:rPrChange w:id="55" w:author="Holger Eichelberger" w:date="2026-06-19T13:13:00Z">
+                  <w:rPrChange w:id="55" w:author="Holger Eichelberger" w:date="2026-06-20T09:36:00Z">
                     <w:rPr/>
                   </w:rPrChange>
                 </w:rPr>
@@ -6133,6 +6123,7 @@
         <w:rPr>
           <w:lang w:val="en-GB"/>
         </w:rPr>
+        <w:lastRenderedPageBreak/>
         <w:t xml:space="preserve">Instantiates the template in </w:t>
       </w:r>
       <w:r>
@@ -6194,7 +6185,6 @@
           <w:b/>
           <w:lang w:val="en-GB"/>
         </w:rPr>
-        <w:lastRenderedPageBreak/>
         <w:t>setOf</w:t>
       </w:r>
       <w:proofErr w:type="spellEnd"/>
@@ -7616,6 +7606,7 @@
         <w:rPr>
           <w:lang w:val="en-GB"/>
         </w:rPr>
+        <w:lastRenderedPageBreak/>
         <w:t xml:space="preserve">Returns the package declaration defined by the </w:t>
       </w:r>
       <w:r>
@@ -7713,7 +7704,6 @@
         <w:rPr>
           <w:lang w:val="en-GB"/>
         </w:rPr>
-        <w:lastRenderedPageBreak/>
         <w:t xml:space="preserve">Returns all qualified names by the </w:t>
       </w:r>
       <w:r>
@@ -9037,6 +9027,7 @@
           <w:b/>
           <w:lang w:val="en-GB"/>
         </w:rPr>
+        <w:lastRenderedPageBreak/>
         <w:t>JavaClass</w:t>
       </w:r>
       <w:proofErr w:type="spellEnd"/>
@@ -9114,7 +9105,6 @@
         <w:rPr>
           <w:lang w:val="en-GB"/>
         </w:rPr>
-        <w:lastRenderedPageBreak/>
         <w:t xml:space="preserve">Returns the </w:t>
       </w:r>
       <w:r>
@@ -13022,14 +13012,7 @@
             <w:b/>
             <w:lang w:val="en-GB"/>
           </w:rPr>
-          <w:t>g</w:t>
-        </w:r>
-        <w:r>
-          <w:rPr>
-            <w:b/>
-            <w:lang w:val="en-GB"/>
-          </w:rPr>
-          <w:t>etComment</w:t>
+          <w:t>getComment</w:t>
         </w:r>
         <w:proofErr w:type="spellEnd"/>
         <w:r>
@@ -13062,13 +13045,7 @@
           <w:rPr>
             <w:lang w:val="en-GB"/>
           </w:rPr>
-          <w:t xml:space="preserve">Returns </w:t>
-        </w:r>
-        <w:r>
-          <w:rPr>
-            <w:lang w:val="en-GB"/>
-          </w:rPr>
-          <w:t>the comment of th</w:t>
+          <w:t>Returns the comment of th</w:t>
         </w:r>
       </w:ins>
       <w:ins w:id="93" w:author="Holger Eichelberger" w:date="2026-06-19T13:08:00Z">
@@ -13147,14 +13124,7 @@
             <w:b/>
             <w:lang w:val="en-GB"/>
           </w:rPr>
-          <w:t>get</w:t>
-        </w:r>
-        <w:r>
-          <w:rPr>
-            <w:b/>
-            <w:lang w:val="en-GB"/>
-          </w:rPr>
-          <w:t>Keys</w:t>
+          <w:t>getKeys</w:t>
         </w:r>
         <w:proofErr w:type="spellEnd"/>
         <w:r>
@@ -13179,13 +13149,7 @@
           <w:rPr>
             <w:lang w:val="en-GB"/>
           </w:rPr>
-          <w:t xml:space="preserve">Returns </w:t>
-        </w:r>
-        <w:r>
-          <w:rPr>
-            <w:lang w:val="en-GB"/>
-          </w:rPr>
-          <w:t xml:space="preserve">all keys in the </w:t>
+          <w:t xml:space="preserve">Returns all keys in the </w:t>
         </w:r>
         <w:r>
           <w:rPr>
@@ -13240,14 +13204,7 @@
             <w:b/>
             <w:lang w:val="en-GB"/>
           </w:rPr>
-          <w:t>map</w:t>
-        </w:r>
-        <w:r>
-          <w:rPr>
-            <w:b/>
-            <w:lang w:val="en-GB"/>
-          </w:rPr>
-          <w:t>Of</w:t>
+          <w:t>mapOf</w:t>
         </w:r>
         <w:proofErr w:type="spellEnd"/>
         <w:r>
@@ -13263,14 +13220,7 @@
             <w:b/>
             <w:lang w:val="en-GB"/>
           </w:rPr>
-          <w:t xml:space="preserve">String, </w:t>
-        </w:r>
-        <w:r>
-          <w:rPr>
-            <w:b/>
-            <w:lang w:val="en-GB"/>
-          </w:rPr>
-          <w:t xml:space="preserve">String) </w:t>
+          <w:t xml:space="preserve">String, String) </w:t>
         </w:r>
         <w:proofErr w:type="spellStart"/>
         <w:r>
@@ -13278,14 +13228,7 @@
             <w:b/>
             <w:lang w:val="en-GB"/>
           </w:rPr>
-          <w:t>get</w:t>
-        </w:r>
-        <w:r>
-          <w:rPr>
-            <w:b/>
-            <w:lang w:val="en-GB"/>
-          </w:rPr>
-          <w:t>Values</w:t>
+          <w:t>getValues</w:t>
         </w:r>
         <w:proofErr w:type="spellEnd"/>
         <w:r>
@@ -13310,19 +13253,7 @@
           <w:rPr>
             <w:lang w:val="en-GB"/>
           </w:rPr>
-          <w:t xml:space="preserve">Returns all </w:t>
-        </w:r>
-        <w:r>
-          <w:rPr>
-            <w:lang w:val="en-GB"/>
-          </w:rPr>
-          <w:t xml:space="preserve">key-value pairs </w:t>
-        </w:r>
-        <w:r>
-          <w:rPr>
-            <w:lang w:val="en-GB"/>
-          </w:rPr>
-          <w:t xml:space="preserve">in the </w:t>
+          <w:t xml:space="preserve">Returns all key-value pairs in the </w:t>
         </w:r>
         <w:r>
           <w:rPr>
@@ -13365,14 +13296,7 @@
             <w:b/>
             <w:lang w:val="en-GB"/>
           </w:rPr>
-          <w:t>String</w:t>
-        </w:r>
-        <w:r>
-          <w:rPr>
-            <w:b/>
-            <w:lang w:val="en-GB"/>
-          </w:rPr>
-          <w:t xml:space="preserve"> </w:t>
+          <w:t xml:space="preserve">String </w:t>
         </w:r>
         <w:proofErr w:type="spellStart"/>
         <w:proofErr w:type="gramStart"/>
@@ -13381,14 +13305,7 @@
             <w:b/>
             <w:lang w:val="en-GB"/>
           </w:rPr>
-          <w:t>get</w:t>
-        </w:r>
-        <w:r>
-          <w:rPr>
-            <w:b/>
-            <w:lang w:val="en-GB"/>
-          </w:rPr>
-          <w:t>Value</w:t>
+          <w:t>getValue</w:t>
         </w:r>
         <w:proofErr w:type="spellEnd"/>
         <w:r>
@@ -13404,14 +13321,7 @@
             <w:b/>
             <w:lang w:val="en-GB"/>
           </w:rPr>
-          <w:t>String k</w:t>
-        </w:r>
-        <w:r>
-          <w:rPr>
-            <w:b/>
-            <w:lang w:val="en-GB"/>
-          </w:rPr>
-          <w:t>)</w:t>
+          <w:t>String k)</w:t>
         </w:r>
       </w:ins>
     </w:p>
@@ -13428,13 +13338,7 @@
           <w:rPr>
             <w:lang w:val="en-GB"/>
           </w:rPr>
-          <w:t xml:space="preserve">Returns </w:t>
-        </w:r>
-        <w:r>
-          <w:rPr>
-            <w:lang w:val="en-GB"/>
-          </w:rPr>
-          <w:t xml:space="preserve">the value associated to </w:t>
+          <w:t xml:space="preserve">Returns the value associated to </w:t>
         </w:r>
         <w:r>
           <w:rPr>
@@ -13522,21 +13426,7 @@
             <w:b/>
             <w:lang w:val="en-GB"/>
           </w:rPr>
-          <w:t>String k</w:t>
-        </w:r>
-        <w:r>
-          <w:rPr>
-            <w:b/>
-            <w:lang w:val="en-GB"/>
-          </w:rPr>
-          <w:t>, String d</w:t>
-        </w:r>
-        <w:r>
-          <w:rPr>
-            <w:b/>
-            <w:lang w:val="en-GB"/>
-          </w:rPr>
-          <w:t>)</w:t>
+          <w:t>String k, String d)</w:t>
         </w:r>
       </w:ins>
     </w:p>
@@ -13640,14 +13530,7 @@
             <w:b/>
             <w:lang w:val="en-GB"/>
           </w:rPr>
-          <w:t>Boolean</w:t>
-        </w:r>
-        <w:r>
-          <w:rPr>
-            <w:b/>
-            <w:lang w:val="en-GB"/>
-          </w:rPr>
-          <w:t xml:space="preserve"> </w:t>
+          <w:t xml:space="preserve">Boolean </w:t>
         </w:r>
         <w:proofErr w:type="spellStart"/>
         <w:proofErr w:type="gramStart"/>
@@ -13656,14 +13539,7 @@
             <w:b/>
             <w:lang w:val="en-GB"/>
           </w:rPr>
-          <w:t>has</w:t>
-        </w:r>
-        <w:r>
-          <w:rPr>
-            <w:b/>
-            <w:lang w:val="en-GB"/>
-          </w:rPr>
-          <w:t>Value</w:t>
+          <w:t>hasValue</w:t>
         </w:r>
         <w:proofErr w:type="spellEnd"/>
         <w:r>
@@ -13696,19 +13572,7 @@
           <w:rPr>
             <w:lang w:val="en-GB"/>
           </w:rPr>
-          <w:t xml:space="preserve">Returns </w:t>
-        </w:r>
-        <w:r>
-          <w:rPr>
-            <w:lang w:val="en-GB"/>
-          </w:rPr>
-          <w:t xml:space="preserve">whether there is a </w:t>
-        </w:r>
-        <w:r>
-          <w:rPr>
-            <w:lang w:val="en-GB"/>
-          </w:rPr>
-          <w:t xml:space="preserve">value associated to </w:t>
+          <w:t xml:space="preserve">Returns whether there is a value associated to </w:t>
         </w:r>
         <w:r>
           <w:rPr>
@@ -13957,56 +13821,7 @@
             <w:b/>
             <w:lang w:val="en-GB"/>
           </w:rPr>
-          <w:t>(</w:t>
-        </w:r>
-        <w:r>
-          <w:rPr>
-            <w:b/>
-            <w:lang w:val="en-GB"/>
-          </w:rPr>
-          <w:t>String</w:t>
-        </w:r>
-        <w:r>
-          <w:rPr>
-            <w:b/>
-            <w:lang w:val="en-GB"/>
-          </w:rPr>
-          <w:t xml:space="preserve">, </w:t>
-        </w:r>
-        <w:r>
-          <w:rPr>
-            <w:b/>
-            <w:lang w:val="en-GB"/>
-          </w:rPr>
-          <w:t>String</w:t>
-        </w:r>
-        <w:r>
-          <w:rPr>
-            <w:b/>
-            <w:lang w:val="en-GB"/>
-          </w:rPr>
-          <w:t>)</w:t>
-        </w:r>
-        <w:r>
-          <w:rPr>
-            <w:b/>
-            <w:lang w:val="en-GB"/>
-          </w:rPr>
-          <w:t xml:space="preserve"> </w:t>
-        </w:r>
-        <w:r>
-          <w:rPr>
-            <w:b/>
-            <w:lang w:val="en-GB"/>
-          </w:rPr>
-          <w:t>m</w:t>
-        </w:r>
-        <w:r>
-          <w:rPr>
-            <w:b/>
-            <w:lang w:val="en-GB"/>
-          </w:rPr>
-          <w:t>)</w:t>
+          <w:t>(String, String) m)</w:t>
         </w:r>
       </w:ins>
     </w:p>
@@ -14023,13 +13838,7 @@
           <w:rPr>
             <w:lang w:val="en-GB"/>
           </w:rPr>
-          <w:t xml:space="preserve">Associates </w:t>
-        </w:r>
-        <w:r>
-          <w:rPr>
-            <w:lang w:val="en-GB"/>
-          </w:rPr>
-          <w:t xml:space="preserve">all key-value pairs </w:t>
+          <w:t xml:space="preserve">Associates all key-value pairs </w:t>
         </w:r>
       </w:ins>
       <w:ins w:id="133" w:author="Holger Eichelberger" w:date="2026-06-19T13:11:00Z">
@@ -14059,13 +13868,7 @@
           <w:rPr>
             <w:lang w:val="en-GB"/>
           </w:rPr>
-          <w:t xml:space="preserve"> </w:t>
-        </w:r>
-        <w:r>
-          <w:rPr>
-            <w:lang w:val="en-GB"/>
-          </w:rPr>
-          <w:t xml:space="preserve">in the </w:t>
+          <w:t xml:space="preserve"> in the </w:t>
         </w:r>
         <w:r>
           <w:rPr>
@@ -14105,25 +13908,18 @@
           <w:numId w:val="11"/>
         </w:numPr>
         <w:rPr>
-          <w:ins w:id="136" w:author="Holger Eichelberger" w:date="2026-06-19T13:11:00Z"/>
-          <w:b/>
-          <w:lang w:val="en-GB"/>
-        </w:rPr>
-      </w:pPr>
-      <w:ins w:id="137" w:author="Holger Eichelberger" w:date="2026-06-19T13:11:00Z">
+          <w:ins w:id="136" w:author="Holger Eichelberger" w:date="2026-06-20T09:36:00Z"/>
+          <w:b/>
+          <w:lang w:val="en-GB"/>
+        </w:rPr>
+      </w:pPr>
+      <w:ins w:id="137" w:author="Holger Eichelberger" w:date="2026-06-20T09:36:00Z">
         <w:r>
           <w:rPr>
             <w:b/>
             <w:lang w:val="en-GB"/>
           </w:rPr>
-          <w:t>Integer</w:t>
-        </w:r>
-        <w:r>
-          <w:rPr>
-            <w:b/>
-            <w:lang w:val="en-GB"/>
-          </w:rPr>
-          <w:t xml:space="preserve"> </w:t>
+          <w:t xml:space="preserve">Integer </w:t>
         </w:r>
         <w:proofErr w:type="gramStart"/>
         <w:r>
@@ -14131,8 +13927,78 @@
             <w:b/>
             <w:lang w:val="en-GB"/>
           </w:rPr>
-          <w:t>size</w:t>
+          <w:t>size(</w:t>
         </w:r>
+        <w:proofErr w:type="gramEnd"/>
+        <w:r>
+          <w:rPr>
+            <w:b/>
+            <w:lang w:val="en-GB"/>
+          </w:rPr>
+          <w:t>)</w:t>
+        </w:r>
+      </w:ins>
+    </w:p>
+    <w:p>
+      <w:pPr>
+        <w:pStyle w:val="ListParagraph"/>
+        <w:numPr>
+          <w:ilvl w:val="0"/>
+          <w:numId w:val="11"/>
+        </w:numPr>
+        <w:rPr>
+          <w:ins w:id="138" w:author="Holger Eichelberger" w:date="2026-06-20T09:36:00Z"/>
+          <w:b/>
+          <w:lang w:val="en-GB"/>
+        </w:rPr>
+      </w:pPr>
+      <w:ins w:id="139" w:author="Holger Eichelberger" w:date="2026-06-20T09:36:00Z">
+        <w:r>
+          <w:rPr>
+            <w:lang w:val="en-GB"/>
+          </w:rPr>
+          <w:t xml:space="preserve">Returns the number of key-value pairs in the </w:t>
+        </w:r>
+        <w:r>
+          <w:rPr>
+            <w:i/>
+            <w:iCs/>
+            <w:lang w:val="en-GB"/>
+          </w:rPr>
+          <w:t>operand</w:t>
+        </w:r>
+        <w:r>
+          <w:rPr>
+            <w:lang w:val="en-GB"/>
+          </w:rPr>
+          <w:t>.</w:t>
+        </w:r>
+      </w:ins>
+    </w:p>
+    <w:p>
+      <w:pPr>
+        <w:pStyle w:val="ListParagraph"/>
+        <w:numPr>
+          <w:ilvl w:val="0"/>
+          <w:numId w:val="11"/>
+        </w:numPr>
+        <w:rPr>
+          <w:ins w:id="140" w:author="Holger Eichelberger" w:date="2026-06-19T13:11:00Z"/>
+          <w:b/>
+          <w:lang w:val="en-GB"/>
+        </w:rPr>
+      </w:pPr>
+      <w:proofErr w:type="gramStart"/>
+      <w:ins w:id="141" w:author="Holger Eichelberger" w:date="2026-06-20T09:36:00Z">
+        <w:r>
+          <w:rPr>
+            <w:b/>
+            <w:lang w:val="en-GB"/>
+          </w:rPr>
+          <w:t>save</w:t>
+        </w:r>
+      </w:ins>
+      <w:ins w:id="142" w:author="Holger Eichelberger" w:date="2026-06-19T13:11:00Z">
         <w:r>
           <w:rPr>
             <w:b/>
@@ -14154,22 +14020,25 @@
       <w:pPr>
         <w:pStyle w:val="ListParagraph"/>
         <w:rPr>
-          <w:ins w:id="138" w:author="Holger Eichelberger" w:date="2026-06-19T13:11:00Z"/>
-          <w:lang w:val="en-GB"/>
-        </w:rPr>
-      </w:pPr>
-      <w:ins w:id="139" w:author="Holger Eichelberger" w:date="2026-06-19T13:11:00Z">
+          <w:ins w:id="143" w:author="Holger Eichelberger" w:date="2026-06-19T13:11:00Z"/>
+          <w:lang w:val="en-GB"/>
+        </w:rPr>
+      </w:pPr>
+      <w:ins w:id="144" w:author="Holger Eichelberger" w:date="2026-06-20T09:36:00Z">
         <w:r>
           <w:rPr>
             <w:lang w:val="en-GB"/>
           </w:rPr>
-          <w:t xml:space="preserve">Returns the number of </w:t>
+          <w:lastRenderedPageBreak/>
+          <w:t>Explicitly saves the artifact</w:t>
         </w:r>
+      </w:ins>
+      <w:ins w:id="145" w:author="Holger Eichelberger" w:date="2026-06-19T13:11:00Z">
         <w:r>
           <w:rPr>
             <w:lang w:val="en-GB"/>
           </w:rPr>
-          <w:t xml:space="preserve">key-value pairs in the </w:t>
+          <w:t xml:space="preserve"> in </w:t>
         </w:r>
         <w:r>
           <w:rPr>
@@ -14192,7 +14061,7 @@
         <w:spacing w:after="0"/>
         <w:jc w:val="left"/>
         <w:rPr>
-          <w:ins w:id="140" w:author="Holger Eichelberger" w:date="2026-06-19T12:52:00Z"/>
+          <w:ins w:id="146" w:author="Holger Eichelberger" w:date="2026-06-19T12:52:00Z"/>
           <w:b/>
           <w:lang w:val="en-GB"/>
         </w:rPr>
@@ -14231,7 +14100,6 @@
           <w:i/>
           <w:lang w:val="en-GB"/>
         </w:rPr>
-        <w:lastRenderedPageBreak/>
         <w:t>Java Compiler</w:t>
       </w:r>
     </w:p>
@@ -14275,7 +14143,7 @@
         </w:rPr>
         <w:t xml:space="preserve"> allows to directly compile</w:t>
       </w:r>
-      <w:bookmarkStart w:id="141" w:name="_Ref393433036"/>
+      <w:bookmarkStart w:id="147" w:name="_Ref393433036"/>
       <w:r>
         <w:rPr>
           <w:rStyle w:val="FootnoteReference"/>
@@ -14283,7 +14151,7 @@
         </w:rPr>
         <w:footnoteReference w:id="6"/>
       </w:r>
-      <w:bookmarkEnd w:id="141"/>
+      <w:bookmarkEnd w:id="147"/>
       <w:r>
         <w:rPr>
           <w:lang w:val="en-GB"/>
@@ -15875,6 +15743,7 @@
         <w:rPr>
           <w:lang w:val="en-GB"/>
         </w:rPr>
+        <w:lastRenderedPageBreak/>
         <w:t xml:space="preserve">Unpacks those artifacts in the JAR file </w:t>
       </w:r>
       <w:r>
@@ -16093,7 +15962,6 @@
           <w:b/>
           <w:lang w:val="en-GB"/>
         </w:rPr>
-        <w:lastRenderedPageBreak/>
         <w:t>setOf</w:t>
       </w:r>
       <w:proofErr w:type="spellEnd"/>
@@ -16238,19 +16106,19 @@
         </w:rPr>
         <w:t>.</w:t>
       </w:r>
-      <w:bookmarkStart w:id="142" w:name="_Ref416534277"/>
+      <w:bookmarkStart w:id="148" w:name="_Ref416534277"/>
     </w:p>
     <w:p>
       <w:pPr>
         <w:pStyle w:val="Heading2"/>
       </w:pPr>
-      <w:bookmarkStart w:id="143" w:name="_Ref174609570"/>
-      <w:bookmarkStart w:id="144" w:name="_Toc174609725"/>
+      <w:bookmarkStart w:id="149" w:name="_Ref174609570"/>
+      <w:bookmarkStart w:id="150" w:name="_Toc174609725"/>
       <w:r>
         <w:t>Java Code</w:t>
       </w:r>
-      <w:bookmarkEnd w:id="143"/>
-      <w:bookmarkEnd w:id="144"/>
+      <w:bookmarkEnd w:id="149"/>
+      <w:bookmarkEnd w:id="150"/>
     </w:p>
     <w:p>
       <w:pPr>
@@ -16386,19 +16254,19 @@
       <w:pPr>
         <w:pStyle w:val="Heading2"/>
       </w:pPr>
-      <w:bookmarkStart w:id="145" w:name="_Toc174609726"/>
-      <w:bookmarkStart w:id="146" w:name="_Ref174609651"/>
-      <w:bookmarkStart w:id="147" w:name="_Toc174609727"/>
-      <w:bookmarkEnd w:id="145"/>
+      <w:bookmarkStart w:id="151" w:name="_Toc174609726"/>
+      <w:bookmarkStart w:id="152" w:name="_Ref174609651"/>
+      <w:bookmarkStart w:id="153" w:name="_Toc174609727"/>
+      <w:bookmarkEnd w:id="151"/>
       <w:proofErr w:type="spellStart"/>
       <w:r>
         <w:t>AspectJ</w:t>
       </w:r>
-      <w:bookmarkEnd w:id="146"/>
-      <w:bookmarkEnd w:id="147"/>
-      <w:proofErr w:type="spellEnd"/>
-    </w:p>
-    <w:bookmarkEnd w:id="142"/>
+      <w:bookmarkEnd w:id="152"/>
+      <w:bookmarkEnd w:id="153"/>
+      <w:proofErr w:type="spellEnd"/>
+    </w:p>
+    <w:bookmarkEnd w:id="148"/>
     <w:p>
       <w:pPr>
         <w:rPr>
@@ -16477,12 +16345,12 @@
       <w:r>
         <w:fldChar w:fldCharType="separate"/>
       </w:r>
-      <w:ins w:id="148" w:author="Holger Eichelberger" w:date="2026-06-19T13:13:00Z">
+      <w:ins w:id="154" w:author="Holger Eichelberger" w:date="2026-06-20T09:36:00Z">
         <w:r>
           <w:rPr>
             <w:vertAlign w:val="superscript"/>
             <w:lang w:val="en-GB"/>
-            <w:rPrChange w:id="149" w:author="Holger Eichelberger" w:date="2026-06-19T13:13:00Z">
+            <w:rPrChange w:id="155" w:author="Holger Eichelberger" w:date="2026-06-20T09:36:00Z">
               <w:rPr>
                 <w:lang w:val="en-US"/>
               </w:rPr>
@@ -16491,7 +16359,7 @@
           <w:t>6</w:t>
         </w:r>
       </w:ins>
-      <w:del w:id="150" w:author="Holger Eichelberger" w:date="2026-06-19T13:13:00Z">
+      <w:del w:id="156" w:author="Holger Eichelberger" w:date="2026-06-19T13:13:00Z">
         <w:r>
           <w:rPr>
             <w:vertAlign w:val="superscript"/>
@@ -16970,15 +16838,15 @@
       <w:pPr>
         <w:pStyle w:val="Heading2"/>
       </w:pPr>
-      <w:bookmarkStart w:id="151" w:name="_Toc422485278"/>
-      <w:bookmarkStart w:id="152" w:name="_Ref393271276"/>
-      <w:bookmarkStart w:id="153" w:name="_Toc174609728"/>
-      <w:bookmarkEnd w:id="151"/>
+      <w:bookmarkStart w:id="157" w:name="_Toc422485278"/>
+      <w:bookmarkStart w:id="158" w:name="_Ref393271276"/>
+      <w:bookmarkStart w:id="159" w:name="_Toc174609728"/>
+      <w:bookmarkEnd w:id="157"/>
       <w:r>
         <w:t>XVCL</w:t>
       </w:r>
-      <w:bookmarkEnd w:id="152"/>
-      <w:bookmarkEnd w:id="153"/>
+      <w:bookmarkEnd w:id="158"/>
+      <w:bookmarkEnd w:id="159"/>
     </w:p>
     <w:p>
       <w:pPr>
@@ -17066,6 +16934,7 @@
           <w:b/>
           <w:lang w:val="en-GB"/>
         </w:rPr>
+        <w:lastRenderedPageBreak/>
         <w:t>Types</w:t>
       </w:r>
     </w:p>
@@ -17109,7 +16978,6 @@
         <w:rPr>
           <w:lang w:val="en-GB"/>
         </w:rPr>
-        <w:lastRenderedPageBreak/>
         <w:t xml:space="preserve">The </w:t>
       </w:r>
       <w:r>
@@ -19369,7 +19237,14 @@
         <w:rPr>
           <w:lang w:val="en-GB"/>
         </w:rPr>
-        <w:t xml:space="preserve"> in some cases. We try to avoid such circumstances, but we cannot guarantee that we covered all possible cases. In such a situation, XVCL would close the whole </w:t>
+        <w:t xml:space="preserve"> in some cases. We try to avoid such circumstances, but we cannot guarantee that we covered all possible cases. In such a situation, XVCL </w:t>
+      </w:r>
+      <w:r>
+        <w:rPr>
+          <w:lang w:val="en-GB"/>
+        </w:rPr>
+        <w:lastRenderedPageBreak/>
+        <w:t xml:space="preserve">would close the whole </w:t>
       </w:r>
       <w:r>
         <w:rPr>
@@ -19402,19 +19277,18 @@
       <w:pPr>
         <w:pStyle w:val="Heading2"/>
       </w:pPr>
-      <w:bookmarkStart w:id="154" w:name="_Ref416534278"/>
-      <w:bookmarkStart w:id="155" w:name="_Toc174609729"/>
-      <w:bookmarkStart w:id="156" w:name="_Ref405934206"/>
-      <w:r>
-        <w:lastRenderedPageBreak/>
+      <w:bookmarkStart w:id="160" w:name="_Ref416534278"/>
+      <w:bookmarkStart w:id="161" w:name="_Toc174609729"/>
+      <w:bookmarkStart w:id="162" w:name="_Ref405934206"/>
+      <w:r>
         <w:t xml:space="preserve">ANT / </w:t>
       </w:r>
       <w:proofErr w:type="spellStart"/>
       <w:r>
         <w:t>Make</w:t>
       </w:r>
-      <w:bookmarkEnd w:id="154"/>
-      <w:bookmarkEnd w:id="155"/>
+      <w:bookmarkEnd w:id="160"/>
+      <w:bookmarkEnd w:id="161"/>
       <w:proofErr w:type="spellEnd"/>
     </w:p>
     <w:p>
@@ -19841,14 +19715,14 @@
       <w:pPr>
         <w:pStyle w:val="Heading2"/>
       </w:pPr>
-      <w:bookmarkStart w:id="157" w:name="_Ref99627456"/>
-      <w:bookmarkStart w:id="158" w:name="_Toc174609730"/>
+      <w:bookmarkStart w:id="163" w:name="_Ref99627456"/>
+      <w:bookmarkStart w:id="164" w:name="_Toc174609730"/>
       <w:r>
         <w:t>Maven</w:t>
       </w:r>
-      <w:bookmarkEnd w:id="156"/>
-      <w:bookmarkEnd w:id="157"/>
-      <w:bookmarkEnd w:id="158"/>
+      <w:bookmarkEnd w:id="162"/>
+      <w:bookmarkEnd w:id="163"/>
+      <w:bookmarkEnd w:id="164"/>
     </w:p>
     <w:p>
       <w:pPr>
@@ -20439,6 +20313,7 @@
           <w:b/>
           <w:lang w:val="en-GB"/>
         </w:rPr>
+        <w:lastRenderedPageBreak/>
         <w:t>maven(</w:t>
       </w:r>
       <w:proofErr w:type="gramEnd"/>
@@ -20477,7 +20352,6 @@
         <w:rPr>
           <w:lang w:val="en-GB"/>
         </w:rPr>
-        <w:lastRenderedPageBreak/>
         <w:t xml:space="preserve">Executes maven with the pom.xml file in </w:t>
       </w:r>
       <w:r>
@@ -21810,13 +21684,13 @@
       <w:pPr>
         <w:pStyle w:val="Heading2"/>
       </w:pPr>
-      <w:bookmarkStart w:id="159" w:name="_Ref99627462"/>
-      <w:bookmarkStart w:id="160" w:name="_Toc174609731"/>
+      <w:bookmarkStart w:id="165" w:name="_Ref99627462"/>
+      <w:bookmarkStart w:id="166" w:name="_Toc174609731"/>
       <w:r>
         <w:t>Docker</w:t>
       </w:r>
-      <w:bookmarkEnd w:id="159"/>
-      <w:bookmarkEnd w:id="160"/>
+      <w:bookmarkEnd w:id="165"/>
+      <w:bookmarkEnd w:id="166"/>
     </w:p>
     <w:p>
       <w:pPr>
@@ -23790,13 +23664,13 @@
       <w:pPr>
         <w:pStyle w:val="Heading2"/>
       </w:pPr>
-      <w:bookmarkStart w:id="161" w:name="_Toc174609732"/>
-      <w:bookmarkStart w:id="162" w:name="_Ref174609756"/>
+      <w:bookmarkStart w:id="167" w:name="_Toc174609732"/>
+      <w:bookmarkStart w:id="168" w:name="_Ref174609756"/>
       <w:r>
         <w:t>LXC</w:t>
       </w:r>
-      <w:bookmarkEnd w:id="161"/>
-      <w:bookmarkEnd w:id="162"/>
+      <w:bookmarkEnd w:id="167"/>
+      <w:bookmarkEnd w:id="168"/>
     </w:p>
     <w:p>
       <w:pPr>
@@ -24838,14 +24712,14 @@
       <w:pPr>
         <w:pStyle w:val="Heading2"/>
       </w:pPr>
-      <w:bookmarkStart w:id="163" w:name="_Ref174609589"/>
-      <w:bookmarkStart w:id="164" w:name="_Toc174609733"/>
+      <w:bookmarkStart w:id="169" w:name="_Ref174609589"/>
+      <w:bookmarkStart w:id="170" w:name="_Toc174609733"/>
       <w:proofErr w:type="spellStart"/>
       <w:r>
         <w:t>Yaml</w:t>
       </w:r>
-      <w:bookmarkEnd w:id="163"/>
-      <w:bookmarkEnd w:id="164"/>
+      <w:bookmarkEnd w:id="169"/>
+      <w:bookmarkEnd w:id="170"/>
       <w:proofErr w:type="spellEnd"/>
     </w:p>
     <w:p>
@@ -26044,7 +25918,7 @@
         </w:rPr>
         <w:t>Yaml</w:t>
       </w:r>
-      <w:commentRangeStart w:id="165"/>
+      <w:commentRangeStart w:id="171"/>
       <w:r>
         <w:rPr>
           <w:rFonts w:ascii="Consolas" w:hAnsi="Consolas"/>
@@ -26052,7 +25926,7 @@
         </w:rPr>
         <w:t>FileArtifact</w:t>
       </w:r>
-      <w:commentRangeEnd w:id="165"/>
+      <w:commentRangeEnd w:id="171"/>
       <w:proofErr w:type="spellEnd"/>
       <w:r>
         <w:rPr>
@@ -26061,7 +25935,7 @@
           <w:sz w:val="24"/>
           <w:szCs w:val="24"/>
         </w:rPr>
-        <w:commentReference w:id="165"/>
+        <w:commentReference w:id="171"/>
       </w:r>
       <w:r>
         <w:rPr>
@@ -30715,14 +30589,14 @@
           <w:lang w:val="en-GB"/>
         </w:rPr>
       </w:pPr>
-      <w:bookmarkStart w:id="166" w:name="_Ref174609594"/>
-      <w:bookmarkStart w:id="167" w:name="_Toc174609734"/>
+      <w:bookmarkStart w:id="172" w:name="_Ref174609594"/>
+      <w:bookmarkStart w:id="173" w:name="_Toc174609734"/>
       <w:r>
         <w:lastRenderedPageBreak/>
         <w:t>JSON</w:t>
       </w:r>
-      <w:bookmarkEnd w:id="166"/>
-      <w:bookmarkEnd w:id="167"/>
+      <w:bookmarkEnd w:id="172"/>
+      <w:bookmarkEnd w:id="173"/>
     </w:p>
     <w:p>
       <w:pPr>
@@ -31075,7 +30949,7 @@
           <w:lang w:val="en-GB"/>
         </w:rPr>
       </w:pPr>
-      <w:bookmarkStart w:id="168" w:name="_Hlk174609338"/>
+      <w:bookmarkStart w:id="174" w:name="_Hlk174609338"/>
       <w:proofErr w:type="spellStart"/>
       <w:r>
         <w:rPr>
@@ -31084,7 +30958,7 @@
         </w:rPr>
         <w:t>JsonNode</w:t>
       </w:r>
-      <w:bookmarkEnd w:id="168"/>
+      <w:bookmarkEnd w:id="174"/>
       <w:proofErr w:type="spellEnd"/>
       <w:r>
         <w:rPr>
@@ -32627,7 +32501,7 @@
         </w:rPr>
         <w:t>Json</w:t>
       </w:r>
-      <w:commentRangeStart w:id="169"/>
+      <w:commentRangeStart w:id="175"/>
       <w:r>
         <w:rPr>
           <w:rFonts w:ascii="Consolas" w:hAnsi="Consolas"/>
@@ -32635,7 +32509,7 @@
         </w:rPr>
         <w:t>FileArtifact</w:t>
       </w:r>
-      <w:commentRangeEnd w:id="169"/>
+      <w:commentRangeEnd w:id="175"/>
       <w:proofErr w:type="spellEnd"/>
       <w:r>
         <w:rPr>
@@ -32644,7 +32518,7 @@
           <w:sz w:val="24"/>
           <w:szCs w:val="24"/>
         </w:rPr>
-        <w:commentReference w:id="169"/>
+        <w:commentReference w:id="175"/>
       </w:r>
       <w:r>
         <w:rPr>
@@ -34757,8 +34631,8 @@
           <w:lang w:val="en-GB"/>
         </w:rPr>
       </w:pPr>
-      <w:bookmarkStart w:id="170" w:name="_Ref485885373"/>
-      <w:bookmarkStart w:id="171" w:name="_Toc174609735"/>
+      <w:bookmarkStart w:id="176" w:name="_Ref485885373"/>
+      <w:bookmarkStart w:id="177" w:name="_Toc174609735"/>
       <w:r>
         <w:rPr>
           <w:lang w:val="en-GB"/>
@@ -34766,8 +34640,8 @@
         <w:lastRenderedPageBreak/>
         <w:t>How to ...?</w:t>
       </w:r>
-      <w:bookmarkEnd w:id="170"/>
-      <w:bookmarkEnd w:id="171"/>
+      <w:bookmarkEnd w:id="176"/>
+      <w:bookmarkEnd w:id="177"/>
     </w:p>
     <w:p>
       <w:pPr>
@@ -34801,14 +34675,14 @@
           <w:lang w:val="en-GB"/>
         </w:rPr>
       </w:pPr>
-      <w:bookmarkStart w:id="172" w:name="_Toc174609736"/>
+      <w:bookmarkStart w:id="178" w:name="_Toc174609736"/>
       <w:r>
         <w:rPr>
           <w:lang w:val="en-GB"/>
         </w:rPr>
         <w:t>VIL</w:t>
       </w:r>
-      <w:bookmarkEnd w:id="172"/>
+      <w:bookmarkEnd w:id="178"/>
     </w:p>
     <w:p>
       <w:pPr>
@@ -34817,7 +34691,7 @@
           <w:lang w:val="en-GB"/>
         </w:rPr>
       </w:pPr>
-      <w:bookmarkStart w:id="173" w:name="_Toc174609737"/>
+      <w:bookmarkStart w:id="179" w:name="_Toc174609737"/>
       <w:proofErr w:type="spellStart"/>
       <w:r>
         <w:rPr>
@@ -34852,7 +34726,7 @@
         </w:rPr>
         <w:t>namespaces</w:t>
       </w:r>
-      <w:bookmarkEnd w:id="173"/>
+      <w:bookmarkEnd w:id="179"/>
     </w:p>
     <w:p>
       <w:pPr>
@@ -35379,14 +35253,14 @@
           <w:lang w:val="en-GB"/>
         </w:rPr>
       </w:pPr>
-      <w:bookmarkStart w:id="174" w:name="_Toc174609738"/>
+      <w:bookmarkStart w:id="180" w:name="_Toc174609738"/>
       <w:r>
         <w:rPr>
           <w:lang w:val="en-GB"/>
         </w:rPr>
         <w:t>Running XVCL</w:t>
       </w:r>
-      <w:bookmarkEnd w:id="174"/>
+      <w:bookmarkEnd w:id="180"/>
     </w:p>
     <w:p>
       <w:pPr>
@@ -36741,7 +36615,7 @@
       <w:r>
         <w:rPr>
           <w:lang w:val="en-GB"/>
-          <w:rPrChange w:id="175" w:author="Holger Eichelberger" w:date="2026-06-19T12:52:00Z">
+          <w:rPrChange w:id="181" w:author="Holger Eichelberger" w:date="2026-06-19T12:52:00Z">
             <w:rPr/>
           </w:rPrChange>
         </w:rPr>
@@ -38287,14 +38161,14 @@
           <w:lang w:val="en-GB"/>
         </w:rPr>
       </w:pPr>
-      <w:bookmarkStart w:id="176" w:name="_Toc174609739"/>
+      <w:bookmarkStart w:id="182" w:name="_Toc174609739"/>
       <w:r>
         <w:rPr>
           <w:lang w:val="en-GB"/>
         </w:rPr>
         <w:t>VIL Template Language</w:t>
       </w:r>
-      <w:bookmarkEnd w:id="176"/>
+      <w:bookmarkEnd w:id="182"/>
     </w:p>
     <w:p>
       <w:pPr>
@@ -38334,14 +38208,14 @@
           <w:lang w:val="en-GB"/>
         </w:rPr>
       </w:pPr>
-      <w:bookmarkStart w:id="177" w:name="_Toc174609740"/>
+      <w:bookmarkStart w:id="183" w:name="_Toc174609740"/>
       <w:r>
         <w:rPr>
           <w:lang w:val="en-GB"/>
         </w:rPr>
         <w:t>All VIL languages</w:t>
       </w:r>
-      <w:bookmarkEnd w:id="177"/>
+      <w:bookmarkEnd w:id="183"/>
     </w:p>
     <w:p>
       <w:pPr>
@@ -38363,8 +38237,8 @@
           <w:lang w:val="en-US"/>
         </w:rPr>
       </w:pPr>
-      <w:bookmarkStart w:id="178" w:name="_Ref434519883"/>
-      <w:bookmarkStart w:id="179" w:name="_Toc174609741"/>
+      <w:bookmarkStart w:id="184" w:name="_Ref434519883"/>
+      <w:bookmarkStart w:id="185" w:name="_Toc174609741"/>
       <w:r>
         <w:rPr>
           <w:lang w:val="en-US"/>
@@ -38377,8 +38251,8 @@
         </w:rPr>
         <w:t>alls</w:t>
       </w:r>
-      <w:bookmarkEnd w:id="178"/>
-      <w:bookmarkEnd w:id="179"/>
+      <w:bookmarkEnd w:id="184"/>
+      <w:bookmarkEnd w:id="185"/>
     </w:p>
     <w:p>
       <w:pPr>
@@ -40646,10 +40520,10 @@
           <w:lang w:val="en-GB"/>
         </w:rPr>
       </w:pPr>
-      <w:bookmarkStart w:id="180" w:name="_Toc179456084"/>
-      <w:bookmarkStart w:id="181" w:name="_Toc313096753"/>
-      <w:bookmarkStart w:id="182" w:name="_Toc449024022"/>
-      <w:bookmarkStart w:id="183" w:name="_Toc174609742"/>
+      <w:bookmarkStart w:id="186" w:name="_Toc179456084"/>
+      <w:bookmarkStart w:id="187" w:name="_Toc313096753"/>
+      <w:bookmarkStart w:id="188" w:name="_Toc449024022"/>
+      <w:bookmarkStart w:id="189" w:name="_Toc174609742"/>
       <w:r>
         <w:rPr>
           <w:lang w:val="en-GB"/>
@@ -40657,10 +40531,10 @@
         <w:lastRenderedPageBreak/>
         <w:t>References</w:t>
       </w:r>
-      <w:bookmarkEnd w:id="180"/>
-      <w:bookmarkEnd w:id="181"/>
-      <w:bookmarkEnd w:id="182"/>
-      <w:bookmarkEnd w:id="183"/>
+      <w:bookmarkEnd w:id="186"/>
+      <w:bookmarkEnd w:id="187"/>
+      <w:bookmarkEnd w:id="188"/>
+      <w:bookmarkEnd w:id="189"/>
     </w:p>
     <w:p>
       <w:pPr>
@@ -40672,21 +40546,21 @@
           <w:lang w:val="en-GB"/>
         </w:rPr>
       </w:pPr>
-      <w:bookmarkStart w:id="184" w:name="BIB__bib"/>
+      <w:bookmarkStart w:id="190" w:name="BIB__bib"/>
       <w:r>
         <w:rPr>
           <w:lang w:val="en-GB"/>
         </w:rPr>
         <w:t>[</w:t>
       </w:r>
-      <w:bookmarkStart w:id="185" w:name="BIB_www_mi_aspectj"/>
+      <w:bookmarkStart w:id="191" w:name="BIB_www_mi_aspectj"/>
       <w:r>
         <w:rPr>
           <w:lang w:val="en-GB"/>
         </w:rPr>
         <w:t>1</w:t>
       </w:r>
-      <w:bookmarkEnd w:id="185"/>
+      <w:bookmarkEnd w:id="191"/>
       <w:r>
         <w:rPr>
           <w:lang w:val="en-GB"/>
@@ -40753,7 +40627,7 @@
         <w:t>http://sse.uni-hildesheim.de/indenica</w:t>
       </w:r>
     </w:p>
-    <w:bookmarkEnd w:id="184"/>
+    <w:bookmarkEnd w:id="190"/>
     <w:p>
       <w:pPr>
         <w:tabs>
@@ -40980,7 +40854,7 @@
 
 <file path=word/comments.xml><?xml version="1.0" encoding="utf-8"?>
 <w:comments xmlns:wpc="http://schemas.microsoft.com/office/word/2010/wordprocessingCanvas" xmlns:cx="http://schemas.microsoft.com/office/drawing/2014/chartex" xmlns:cx1="http://schemas.microsoft.com/office/drawing/2015/9/8/chartex" xmlns:cx2="http://schemas.microsoft.com/office/drawing/2015/10/21/chartex" xmlns:cx3="http://schemas.microsoft.com/office/drawing/2016/5/9/chartex" xmlns:cx4="http://schemas.microsoft.com/office/drawing/2016/5/10/chartex" xmlns:cx5="http://schemas.microsoft.com/office/drawing/2016/5/11/chartex" xmlns:cx6="http://schemas.microsoft.com/office/drawing/2016/5/12/chartex" xmlns:cx7="http://schemas.microsoft.com/office/drawing/2016/5/13/chartex" xmlns:cx8="http://schemas.microsoft.com/office/drawing/2016/5/14/chartex" xmlns:mc="http://schemas.openxmlformats.org/markup-compatibility/2006" xmlns:aink="http://schemas.microsoft.com/office/drawing/2016/ink" xmlns:am3d="http://schemas.microsoft.com/office/drawing/2017/model3d" xmlns:o="urn:schemas-microsoft-com:office:office" xmlns:oel="http://schemas.microsoft.com/office/2019/extlst" xmlns:r="http://schemas.openxmlformats.org/officeDocument/2006/relationships" xmlns:m="http://schemas.openxmlformats.org/officeDocument/2006/math" xmlns:v="urn:schemas-microsoft-com:vml" xmlns:wp14="http://schemas.microsoft.com/office/word/2010/wordprocessingDrawing" xmlns:wp="http://schemas.openxmlformats.org/drawingml/2006/wordprocessingDrawing" xmlns:w10="urn:schemas-microsoft-com:office:word" xmlns:w="http://schemas.openxmlformats.org/wordprocessingml/2006/main" xmlns:w14="http://schemas.microsoft.com/office/word/2010/wordml" xmlns:w15="http://schemas.microsoft.com/office/word/2012/wordml" xmlns:w16cex="http://schemas.microsoft.com/office/word/2018/wordml/cex" xmlns:w16cid="http://schemas.microsoft.com/office/word/2016/wordml/cid" xmlns:w16="http://schemas.microsoft.com/office/word/2018/wordml" xmlns:w16sdtdh="http://schemas.microsoft.com/office/word/2020/wordml/sdtdatahash" xmlns:w16se="http://schemas.microsoft.com/office/word/2015/wordml/symex" xmlns:wpg="http://schemas.microsoft.com/office/word/2010/wordprocessingGroup" xmlns:wpi="http://schemas.microsoft.com/office/word/2010/wordprocessingInk" xmlns:wne="http://schemas.microsoft.com/office/word/2006/wordml" xmlns:wps="http://schemas.microsoft.com/office/word/2010/wordprocessingShape" mc:Ignorable="w14 w15 w16se w16cid w16 w16cex w16sdtdh wp14">
-  <w:comment w:id="165" w:author="Holger Eichelberger" w:date="2017-06-22T08:45:00Z" w:initials="he">
+  <w:comment w:id="171" w:author="Holger Eichelberger" w:date="2017-06-22T08:45:00Z" w:initials="he">
     <w:p>
       <w:pPr>
         <w:pStyle w:val="CommentText"/>
@@ -41002,7 +40876,7 @@
       </w:r>
     </w:p>
   </w:comment>
-  <w:comment w:id="169" w:author="Holger Eichelberger" w:date="2017-06-22T08:45:00Z" w:initials="he">
+  <w:comment w:id="175" w:author="Holger Eichelberger" w:date="2017-06-22T08:45:00Z" w:initials="he">
     <w:p>
       <w:pPr>
         <w:pStyle w:val="CommentText"/>

</xml_diff>